<commit_message>
Atualiza documento de visão, ponto 3 a 5.
Adiciona partes interessadas ao documento de visão
</commit_message>
<xml_diff>
--- a/Documento de Visão - NDN TRANSPORTES.docx
+++ b/Documento de Visão - NDN TRANSPORTES.docx
@@ -957,19 +957,479 @@
           <w:sz w:val="28"/>
           <w:szCs w:val="28"/>
         </w:rPr>
-        <w:t xml:space="preserve">Tipo de usuário </w:t>
+        <w:t xml:space="preserve">Tipo de usuário: Funcionário capacitado a usar os requisitos da aplicação conforme os requerimentos adquiridos durante o documento. </w:t>
+      </w:r>
+    </w:p>
+    <w:p>
+      <w:pPr>
+        <w:pStyle w:val="PargrafodaLista"/>
+        <w:pBdr>
+          <w:bar w:val="single" w:sz="4" w:color="auto"/>
+        </w:pBdr>
+        <w:rPr>
+          <w:sz w:val="28"/>
+          <w:szCs w:val="28"/>
+        </w:rPr>
+      </w:pPr>
+    </w:p>
+    <w:p>
+      <w:pPr>
+        <w:pStyle w:val="PargrafodaLista"/>
+        <w:pBdr>
+          <w:bar w:val="single" w:sz="4" w:color="auto"/>
+        </w:pBdr>
+        <w:rPr>
+          <w:sz w:val="28"/>
+          <w:szCs w:val="28"/>
+        </w:rPr>
+      </w:pPr>
+    </w:p>
+    <w:p>
+      <w:pPr>
+        <w:pStyle w:val="PargrafodaLista"/>
+        <w:pBdr>
+          <w:bar w:val="single" w:sz="4" w:color="auto"/>
+        </w:pBdr>
+        <w:rPr>
+          <w:sz w:val="28"/>
+          <w:szCs w:val="28"/>
+        </w:rPr>
+      </w:pPr>
+    </w:p>
+    <w:p>
+      <w:pPr>
+        <w:pBdr>
+          <w:bar w:val="single" w:sz="4" w:color="auto"/>
+        </w:pBdr>
+        <w:rPr>
+          <w:sz w:val="28"/>
+          <w:szCs w:val="28"/>
+        </w:rPr>
+      </w:pPr>
+      <w:r>
+        <w:rPr>
+          <w:sz w:val="28"/>
+          <w:szCs w:val="28"/>
+        </w:rPr>
+        <w:lastRenderedPageBreak/>
+        <w:t xml:space="preserve">3.3 </w:t>
+      </w:r>
+      <w:r>
+        <w:rPr>
+          <w:sz w:val="28"/>
+          <w:szCs w:val="28"/>
+        </w:rPr>
+        <w:t>Necessidades das Partes Interessadas ou Usuários</w:t>
+      </w:r>
+    </w:p>
+    <w:p>
+      <w:pPr>
+        <w:pStyle w:val="PargrafodaLista"/>
+        <w:pBdr>
+          <w:bar w:val="single" w:sz="4" w:color="auto"/>
+        </w:pBdr>
+        <w:rPr>
+          <w:sz w:val="28"/>
+          <w:szCs w:val="28"/>
+        </w:rPr>
+      </w:pPr>
+      <w:r>
+        <w:rPr>
+          <w:sz w:val="28"/>
+          <w:szCs w:val="28"/>
+        </w:rPr>
+        <w:t>As necessidades que os usuários deverão adquirir e as funcionalidades que precisam durante do projeto será o manuseio da aplicação.</w:t>
+      </w:r>
+    </w:p>
+    <w:p>
+      <w:pPr>
+        <w:pStyle w:val="PargrafodaLista"/>
+        <w:pBdr>
+          <w:bar w:val="single" w:sz="4" w:color="auto"/>
+        </w:pBdr>
+        <w:rPr>
+          <w:sz w:val="28"/>
+          <w:szCs w:val="28"/>
+        </w:rPr>
+      </w:pPr>
+    </w:p>
+    <w:p>
+      <w:pPr>
+        <w:pStyle w:val="PargrafodaLista"/>
+        <w:pBdr>
+          <w:bar w:val="single" w:sz="4" w:color="auto"/>
+        </w:pBdr>
+        <w:rPr>
+          <w:sz w:val="28"/>
+          <w:szCs w:val="28"/>
+        </w:rPr>
+      </w:pPr>
+      <w:r>
+        <w:rPr>
+          <w:sz w:val="28"/>
+          <w:szCs w:val="28"/>
+        </w:rPr>
+        <w:t xml:space="preserve">3.3.1 </w:t>
+      </w:r>
+      <w:r>
+        <w:rPr>
+          <w:sz w:val="28"/>
+          <w:szCs w:val="28"/>
+        </w:rPr>
+        <w:t xml:space="preserve">Detalhamento dos Representantes das Partes Interessadas </w:t>
+      </w:r>
+    </w:p>
+    <w:p>
+      <w:pPr>
+        <w:pStyle w:val="PargrafodaLista"/>
+        <w:pBdr>
+          <w:bar w:val="single" w:sz="4" w:color="auto"/>
+        </w:pBdr>
+        <w:rPr>
+          <w:sz w:val="28"/>
+          <w:szCs w:val="28"/>
+        </w:rPr>
+      </w:pPr>
+      <w:r>
+        <w:rPr>
+          <w:sz w:val="28"/>
+          <w:szCs w:val="28"/>
+        </w:rPr>
+        <w:t>Nome: Rafael Andrade</w:t>
+      </w:r>
+    </w:p>
+    <w:p>
+      <w:pPr>
+        <w:pStyle w:val="PargrafodaLista"/>
+        <w:pBdr>
+          <w:bar w:val="single" w:sz="4" w:color="auto"/>
+        </w:pBdr>
+        <w:rPr>
+          <w:sz w:val="28"/>
+          <w:szCs w:val="28"/>
+        </w:rPr>
+      </w:pPr>
+      <w:r>
+        <w:rPr>
+          <w:sz w:val="28"/>
+          <w:szCs w:val="28"/>
+        </w:rPr>
+        <w:t xml:space="preserve">E-mail Institucional: </w:t>
+      </w:r>
+      <w:hyperlink r:id="rId6" w:history="1">
+        <w:r>
+          <w:rPr>
+            <w:rStyle w:val="Hyperlink"/>
+            <w:sz w:val="28"/>
+            <w:szCs w:val="28"/>
+          </w:rPr>
+          <w:t>exemplo@gmail.com</w:t>
+        </w:r>
+      </w:hyperlink>
+    </w:p>
+    <w:p>
+      <w:pPr>
+        <w:pStyle w:val="PargrafodaLista"/>
+        <w:pBdr>
+          <w:bar w:val="single" w:sz="4" w:color="auto"/>
+        </w:pBdr>
+        <w:rPr>
+          <w:sz w:val="28"/>
+          <w:szCs w:val="28"/>
+        </w:rPr>
+      </w:pPr>
+      <w:r>
+        <w:rPr>
+          <w:sz w:val="28"/>
+          <w:szCs w:val="28"/>
+        </w:rPr>
+        <w:t>Responsabilidade: Os interesses deverão ser: Cadastro de Pacotes, Separação de Pacotes, Confirmação de Pacotes, Embalo de pacotes e por fim o envio.</w:t>
+      </w:r>
+    </w:p>
+    <w:p>
+      <w:pPr>
+        <w:pStyle w:val="PargrafodaLista"/>
+        <w:pBdr>
+          <w:bar w:val="single" w:sz="4" w:color="auto"/>
+        </w:pBdr>
+        <w:rPr>
+          <w:sz w:val="28"/>
+          <w:szCs w:val="28"/>
+        </w:rPr>
+      </w:pPr>
+    </w:p>
+    <w:p>
+      <w:pPr>
+        <w:pStyle w:val="PargrafodaLista"/>
+        <w:pBdr>
+          <w:bar w:val="single" w:sz="4" w:color="auto"/>
+        </w:pBdr>
+        <w:rPr>
+          <w:sz w:val="28"/>
+          <w:szCs w:val="28"/>
+        </w:rPr>
+      </w:pPr>
+      <w:r>
+        <w:rPr>
+          <w:sz w:val="28"/>
+          <w:szCs w:val="28"/>
+        </w:rPr>
+        <w:t xml:space="preserve">3.2 Usuários </w:t>
+      </w:r>
+    </w:p>
+    <w:p>
+      <w:pPr>
+        <w:pStyle w:val="PargrafodaLista"/>
+        <w:pBdr>
+          <w:bar w:val="single" w:sz="4" w:color="auto"/>
+        </w:pBdr>
+        <w:rPr>
+          <w:sz w:val="28"/>
+          <w:szCs w:val="28"/>
+        </w:rPr>
+      </w:pPr>
+    </w:p>
+    <w:p>
+      <w:pPr>
+        <w:pStyle w:val="PargrafodaLista"/>
+        <w:pBdr>
+          <w:bar w:val="single" w:sz="4" w:color="auto"/>
+        </w:pBdr>
+        <w:rPr>
+          <w:sz w:val="28"/>
+          <w:szCs w:val="28"/>
+        </w:rPr>
+      </w:pPr>
+      <w:r>
+        <w:rPr>
+          <w:sz w:val="28"/>
+          <w:szCs w:val="28"/>
+        </w:rPr>
+        <w:t>Tipo de Usuário: Representante da Empresa ou Usuário da Aplicação</w:t>
+      </w:r>
+    </w:p>
+    <w:p>
+      <w:pPr>
+        <w:pStyle w:val="PargrafodaLista"/>
+        <w:pBdr>
+          <w:bar w:val="single" w:sz="4" w:color="auto"/>
+        </w:pBdr>
+        <w:rPr>
+          <w:sz w:val="28"/>
+          <w:szCs w:val="28"/>
+        </w:rPr>
+      </w:pPr>
+    </w:p>
+    <w:p>
+      <w:pPr>
+        <w:pStyle w:val="PargrafodaLista"/>
+        <w:pBdr>
+          <w:bar w:val="single" w:sz="4" w:color="auto"/>
+        </w:pBdr>
+        <w:rPr>
+          <w:sz w:val="28"/>
+          <w:szCs w:val="28"/>
+        </w:rPr>
+      </w:pPr>
+      <w:r>
+        <w:rPr>
+          <w:sz w:val="28"/>
+          <w:szCs w:val="28"/>
+        </w:rPr>
+        <w:t xml:space="preserve">Representantes: Rafael Andrade (Representante da Parte Interessada) </w:t>
+      </w:r>
+    </w:p>
+    <w:p>
+      <w:pPr>
+        <w:pStyle w:val="PargrafodaLista"/>
+        <w:pBdr>
+          <w:bar w:val="single" w:sz="4" w:color="auto"/>
+        </w:pBdr>
+        <w:rPr>
+          <w:sz w:val="28"/>
+          <w:szCs w:val="28"/>
+        </w:rPr>
+      </w:pPr>
+    </w:p>
+    <w:p>
+      <w:pPr>
+        <w:pStyle w:val="PargrafodaLista"/>
+        <w:pBdr>
+          <w:bar w:val="single" w:sz="4" w:color="auto"/>
+        </w:pBdr>
+        <w:rPr>
+          <w:sz w:val="28"/>
+          <w:szCs w:val="28"/>
+        </w:rPr>
+      </w:pPr>
+      <w:r>
+        <w:rPr>
+          <w:sz w:val="28"/>
+          <w:szCs w:val="28"/>
+        </w:rPr>
+        <w:t>Descrição: O tipo de usuário será o usuário com mais dificuldade em cadastro de pacotes, organização, envio.</w:t>
+      </w:r>
+    </w:p>
+    <w:p>
+      <w:pPr>
+        <w:pStyle w:val="PargrafodaLista"/>
+        <w:pBdr>
+          <w:bar w:val="single" w:sz="4" w:color="auto"/>
+        </w:pBdr>
+        <w:rPr>
+          <w:sz w:val="28"/>
+          <w:szCs w:val="28"/>
+        </w:rPr>
+      </w:pPr>
+    </w:p>
+    <w:p>
+      <w:pPr>
+        <w:pStyle w:val="PargrafodaLista"/>
+        <w:pBdr>
+          <w:bar w:val="single" w:sz="4" w:color="auto"/>
+        </w:pBdr>
+        <w:rPr>
+          <w:sz w:val="28"/>
+          <w:szCs w:val="28"/>
+        </w:rPr>
+      </w:pPr>
+      <w:r>
+        <w:rPr>
+          <w:sz w:val="28"/>
+          <w:szCs w:val="28"/>
+        </w:rPr>
+        <w:t>Responsabilidade: O usuário deverá se adaptar ao longo dos períodos da utilização da aplicação, para que ocorra um bom aproveitamento do aplicativo</w:t>
+      </w:r>
+    </w:p>
+    <w:p>
+      <w:pPr>
+        <w:pStyle w:val="PargrafodaLista"/>
+        <w:pBdr>
+          <w:bar w:val="single" w:sz="4" w:color="auto"/>
+        </w:pBdr>
+        <w:rPr>
+          <w:sz w:val="28"/>
+          <w:szCs w:val="28"/>
+        </w:rPr>
+      </w:pPr>
+    </w:p>
+    <w:p>
+      <w:pPr>
+        <w:pStyle w:val="PargrafodaLista"/>
+        <w:numPr>
+          <w:ilvl w:val="0"/>
+          <w:numId w:val="1"/>
+        </w:numPr>
+        <w:pBdr>
+          <w:bar w:val="single" w:sz="4" w:color="auto"/>
+        </w:pBdr>
+        <w:rPr>
+          <w:sz w:val="40"/>
+          <w:szCs w:val="40"/>
+        </w:rPr>
+      </w:pPr>
+      <w:r>
+        <w:rPr>
+          <w:sz w:val="40"/>
+          <w:szCs w:val="40"/>
+        </w:rPr>
+        <w:t>Objetivos de Negócio</w:t>
+      </w:r>
+    </w:p>
+    <w:p>
+      <w:pPr>
+        <w:pStyle w:val="PargrafodaLista"/>
+        <w:pBdr>
+          <w:bar w:val="single" w:sz="4" w:color="auto"/>
+        </w:pBdr>
+        <w:ind w:left="450"/>
+        <w:rPr>
+          <w:sz w:val="24"/>
+          <w:szCs w:val="24"/>
+        </w:rPr>
+      </w:pPr>
+      <w:r>
+        <w:rPr>
+          <w:sz w:val="24"/>
+          <w:szCs w:val="24"/>
+        </w:rPr>
+        <w:t xml:space="preserve">O Objetivo da Aplicação “NDN Transportes” para usuários de transporte será solucionar o problema em que funcionários da empresa estejam passando por diversas dificuldades entre a separação, envio e organização de pacotes, onde acaba gerando um grande tumulto em cada processo. Com isso a “NDN </w:t>
+      </w:r>
+      <w:proofErr w:type="gramStart"/>
+      <w:r>
+        <w:rPr>
+          <w:sz w:val="24"/>
+          <w:szCs w:val="24"/>
+        </w:rPr>
+        <w:t>Transportes ” vem</w:t>
+      </w:r>
+      <w:proofErr w:type="gramEnd"/>
+      <w:r>
+        <w:rPr>
+          <w:sz w:val="24"/>
+          <w:szCs w:val="24"/>
+        </w:rPr>
+        <w:t xml:space="preserve"> esclarecer a todos os clientes que necessitam de uma boa aplicação organizada, intuitiva que estará aberta todos suporte aos usuários que estão em sua jornada desorganizada de trabalho</w:t>
+      </w:r>
+    </w:p>
+    <w:p>
+      <w:pPr>
+        <w:pStyle w:val="PargrafodaLista"/>
+        <w:pBdr>
+          <w:bar w:val="single" w:sz="4" w:color="auto"/>
+        </w:pBdr>
+        <w:ind w:left="450"/>
+        <w:rPr>
+          <w:sz w:val="24"/>
+          <w:szCs w:val="24"/>
+        </w:rPr>
+      </w:pPr>
+    </w:p>
+    <w:p>
+      <w:pPr>
+        <w:pStyle w:val="PargrafodaLista"/>
+        <w:numPr>
+          <w:ilvl w:val="0"/>
+          <w:numId w:val="1"/>
+        </w:numPr>
+        <w:pBdr>
+          <w:bar w:val="single" w:sz="4" w:color="auto"/>
+        </w:pBdr>
+        <w:rPr>
+          <w:sz w:val="40"/>
+          <w:szCs w:val="40"/>
+        </w:rPr>
+      </w:pPr>
+      <w:r>
+        <w:rPr>
+          <w:sz w:val="40"/>
+          <w:szCs w:val="40"/>
+        </w:rPr>
+        <w:t>Visão Geral do Produto</w:t>
+      </w:r>
+    </w:p>
+    <w:p>
+      <w:pPr>
+        <w:pStyle w:val="PargrafodaLista"/>
+        <w:pBdr>
+          <w:bar w:val="single" w:sz="4" w:color="auto"/>
+        </w:pBdr>
+        <w:ind w:left="450"/>
+        <w:rPr>
+          <w:sz w:val="40"/>
+          <w:szCs w:val="40"/>
+        </w:rPr>
+      </w:pPr>
+      <w:r>
+        <w:rPr>
+          <w:sz w:val="24"/>
+          <w:szCs w:val="24"/>
+        </w:rPr>
+        <w:lastRenderedPageBreak/>
+        <w:t>Essa seção possui breve informações para os usuários da aplicação que estarão dispostos ao uso dessa aplicação</w:t>
       </w:r>
       <w:bookmarkStart w:id="0" w:name="_GoBack"/>
       <w:bookmarkEnd w:id="0"/>
-    </w:p>
-    <w:p>
-      <w:pPr>
-        <w:jc w:val="center"/>
-        <w:rPr>
-          <w:sz w:val="28"/>
-          <w:szCs w:val="28"/>
-        </w:rPr>
-      </w:pPr>
     </w:p>
     <w:sectPr>
       <w:pgSz w:w="11906" w:h="16838"/>

</xml_diff>